<commit_message>
Implement final HR letter templates
</commit_message>
<xml_diff>
--- a/backend/app/assets/hr_letters/special-increment-template.docx
+++ b/backend/app/assets/hr_letters/special-increment-template.docx
@@ -4,6 +4,8 @@
   <w:body>
     <w:p>
       <w:pPr>
+        <w:spacing w:after="0"/>
+        <w:jc w:val="left"/>
         <w:rPr>
           <w:b/>
           <w:bCs/>
@@ -28,6 +30,7 @@
     </w:p>
     <w:p>
       <w:pPr>
+        <w:spacing w:before="1600"/>
         <w:ind w:left="6480"/>
         <w:jc w:val="right"/>
       </w:pPr>
@@ -190,7 +193,7 @@
         <w:rPr>
           <w:rFonts w:ascii="Times New Roman" w:hAnsi="Times New Roman" w:cs="Times New Roman"/>
         </w:rPr>
-        <w:t>W.E.F {{effective_date_long}}</w:t>
+        <w:t>W.E.F {{effective_date}}</w:t>
       </w:r>
       <w:r>
         <w:rPr>
@@ -222,7 +225,7 @@
         <w:rPr>
           <w:rFonts w:ascii="Times New Roman" w:hAnsi="Times New Roman" w:cs="Times New Roman"/>
         </w:rPr>
-        <w:t xml:space="preserve">Your revised gross salary will be {{revised_gross_salary}} </w:t>
+        <w:t xml:space="preserve">Your revised gross salary will be {{revised_salary}} </w:t>
       </w:r>
       <w:r>
         <w:rPr>
@@ -291,6 +294,7 @@
     </w:p>
     <w:p>
       <w:pPr>
+        <w:spacing w:before="0" w:after="0" w:lineRule="exact" w:line="20"/>
         <w:rPr>
           <w:rFonts w:ascii="Times New Roman" w:hAnsi="Times New Roman" w:cs="Times New Roman"/>
         </w:rPr>
@@ -298,6 +302,7 @@
     </w:p>
     <w:p>
       <w:pPr>
+        <w:spacing w:before="0" w:after="0" w:lineRule="exact" w:line="20"/>
         <w:rPr>
           <w:rFonts w:ascii="Times New Roman" w:hAnsi="Times New Roman" w:cs="Times New Roman"/>
         </w:rPr>
@@ -305,6 +310,7 @@
     </w:p>
     <w:p>
       <w:pPr>
+        <w:spacing w:before="0" w:after="0" w:lineRule="exact" w:line="20"/>
         <w:rPr>
           <w:rFonts w:ascii="Times New Roman" w:hAnsi="Times New Roman" w:cs="Times New Roman"/>
         </w:rPr>
@@ -312,6 +318,7 @@
     </w:p>
     <w:p>
       <w:pPr>
+        <w:keepNext/>
         <w:rPr>
           <w:rFonts w:ascii="Times New Roman" w:hAnsi="Times New Roman" w:cs="Times New Roman"/>
         </w:rPr>
@@ -325,6 +332,8 @@
     </w:p>
     <w:p>
       <w:pPr>
+        <w:keepNext/>
+        <w:spacing w:before="0" w:after="0" w:lineRule="exact" w:line="20"/>
         <w:rPr>
           <w:rFonts w:ascii="Times New Roman" w:hAnsi="Times New Roman" w:cs="Times New Roman"/>
         </w:rPr>
@@ -332,6 +341,8 @@
     </w:p>
     <w:p>
       <w:pPr>
+        <w:keepNext w:val="0"/>
+        <w:keepLines/>
         <w:rPr>
           <w:rFonts w:ascii="Times New Roman" w:hAnsi="Times New Roman" w:cs="Times New Roman"/>
           <w:b/>
@@ -345,7 +356,6 @@
         <w:rPr>
           <w:rFonts w:ascii="Times New Roman" w:hAnsi="Times New Roman" w:cs="Times New Roman"/>
         </w:rPr>
-        <w:br/>
       </w:r>
       <w:r>
         <w:rPr>
@@ -381,6 +391,7 @@
     </w:p>
     <w:p>
       <w:pPr>
+        <w:spacing w:before="0" w:after="0" w:lineRule="exact" w:line="20"/>
         <w:rPr>
           <w:rFonts w:ascii="Times New Roman" w:hAnsi="Times New Roman" w:cs="Times New Roman"/>
         </w:rPr>
@@ -388,6 +399,7 @@
     </w:p>
     <w:p>
       <w:pPr>
+        <w:spacing w:before="0" w:after="0" w:lineRule="exact" w:line="20"/>
         <w:ind w:left="2160"/>
         <w:rPr>
           <w:rFonts w:ascii="Times New Roman" w:hAnsi="Times New Roman" w:cs="Times New Roman"/>
@@ -398,6 +410,7 @@
     </w:p>
     <w:p>
       <w:pPr>
+        <w:spacing w:before="0" w:after="0" w:lineRule="exact" w:line="20"/>
         <w:rPr>
           <w:rFonts w:ascii="Times New Roman" w:hAnsi="Times New Roman" w:cs="Times New Roman"/>
           <w:b/>
@@ -407,6 +420,7 @@
     </w:p>
     <w:p>
       <w:pPr>
+        <w:spacing w:before="0" w:after="0" w:lineRule="exact" w:line="20"/>
         <w:ind w:left="2160"/>
         <w:rPr>
           <w:rFonts w:ascii="Times New Roman" w:hAnsi="Times New Roman" w:cs="Times New Roman"/>
@@ -427,6 +441,7 @@
     </w:p>
     <w:p>
       <w:pPr>
+        <w:pageBreakBefore/>
         <w:ind w:left="2160"/>
         <w:rPr>
           <w:rFonts w:ascii="Times New Roman" w:hAnsi="Times New Roman" w:cs="Times New Roman"/>
@@ -497,7 +512,7 @@
           <w:szCs w:val="20"/>
           <w:lang w:val="en-US"/>
         </w:rPr>
-        <w:t xml:space="preserve">{{appointment_reference}} dated </w:t>
+        <w:t xml:space="preserve">{{appt_ref}} dated </w:t>
       </w:r>
       <w:r>
         <w:rPr>
@@ -525,7 +540,7 @@
           <w:szCs w:val="20"/>
           <w:lang w:val="en-US"/>
         </w:rPr>
-        <w:t>{{appointment_date}}</w:t>
+        <w:t>{{appt_date}}</w:t>
       </w:r>
       <w:r>
         <w:rPr>
@@ -938,7 +953,7 @@
                       <w:lang w:eastAsia="en-IN"/>
                       <w14:ligatures w14:val="none"/>
                     </w:rPr>
-                    <w:t>{{salary_basic_salary_existing}}</w:t>
+                    <w:t>{{salary_b_existing}}</w:t>
                   </w:r>
                   <w:r>
                     <w:rPr>
@@ -990,7 +1005,7 @@
                       <w:lang w:eastAsia="en-IN"/>
                       <w14:ligatures w14:val="none"/>
                     </w:rPr>
-                    <w:t>{{salary_basic_salary_revised}}</w:t>
+                    <w:t>{{salary_b_revised}}</w:t>
                   </w:r>
                 </w:p>
               </w:tc>
@@ -1076,7 +1091,7 @@
                       <w:lang w:eastAsia="en-IN"/>
                       <w14:ligatures w14:val="none"/>
                     </w:rPr>
-                    <w:t>{{salary_house_rent_allowance_existing}}</w:t>
+                    <w:t>{{salary_h_existing}}</w:t>
                   </w:r>
                 </w:p>
               </w:tc>
@@ -1117,7 +1132,7 @@
                       <w:lang w:eastAsia="en-IN"/>
                       <w14:ligatures w14:val="none"/>
                     </w:rPr>
-                    <w:t>{{salary_house_rent_allowance_revised}}</w:t>
+                    <w:t>{{salary_h_revised}}</w:t>
                   </w:r>
                 </w:p>
               </w:tc>
@@ -1203,7 +1218,7 @@
                       <w:lang w:eastAsia="en-IN"/>
                       <w14:ligatures w14:val="none"/>
                     </w:rPr>
-                    <w:t>{{salary_conveyance_allowance_existing}}</w:t>
+                    <w:t>{{salary_c_existing}}</w:t>
                   </w:r>
                 </w:p>
               </w:tc>
@@ -1244,7 +1259,7 @@
                       <w:lang w:eastAsia="en-IN"/>
                       <w14:ligatures w14:val="none"/>
                     </w:rPr>
-                    <w:t>{{salary_conveyance_allowance_revised}}</w:t>
+                    <w:t>{{salary_c_revised}}</w:t>
                   </w:r>
                 </w:p>
               </w:tc>
@@ -1330,7 +1345,7 @@
                       <w:lang w:eastAsia="en-IN"/>
                       <w14:ligatures w14:val="none"/>
                     </w:rPr>
-                    <w:t>{{salary_medical_reimbursement_existing}}</w:t>
+                    <w:t>{{salary_m_existing}}</w:t>
                   </w:r>
                 </w:p>
               </w:tc>
@@ -1371,7 +1386,7 @@
                       <w:lang w:eastAsia="en-IN"/>
                       <w14:ligatures w14:val="none"/>
                     </w:rPr>
-                    <w:t>{{salary_medical_reimbursement_revised}}</w:t>
+                    <w:t>{{salary_m_revised}}</w:t>
                   </w:r>
                 </w:p>
               </w:tc>
@@ -1457,7 +1472,7 @@
                       <w:lang w:eastAsia="en-IN"/>
                       <w14:ligatures w14:val="none"/>
                     </w:rPr>
-                    <w:t>{{salary_special_allowance_existing}}</w:t>
+                    <w:t>{{salary_s_existing}}</w:t>
                   </w:r>
                   <w:r>
                     <w:rPr>
@@ -1509,7 +1524,7 @@
                       <w:lang w:eastAsia="en-IN"/>
                       <w14:ligatures w14:val="none"/>
                     </w:rPr>
-                    <w:t>{{salary_special_allowance_revised}}</w:t>
+                    <w:t>{{salary_s_revised}}</w:t>
                   </w:r>
                 </w:p>
               </w:tc>
@@ -1595,7 +1610,7 @@
                       <w:lang w:eastAsia="en-IN"/>
                       <w14:ligatures w14:val="none"/>
                     </w:rPr>
-                    <w:t>{{salary_variable_pay_existing}}</w:t>
+                    <w:t>{{salary_v_existing}}</w:t>
                   </w:r>
                 </w:p>
               </w:tc>
@@ -1636,7 +1651,7 @@
                       <w:lang w:eastAsia="en-IN"/>
                       <w14:ligatures w14:val="none"/>
                     </w:rPr>
-                    <w:t>{{salary_variable_pay_revised}}</w:t>
+                    <w:t>{{salary_v_revised}}</w:t>
                   </w:r>
                 </w:p>
               </w:tc>
@@ -1756,7 +1771,7 @@
                       <w:lang w:eastAsia="en-IN"/>
                       <w14:ligatures w14:val="none"/>
                     </w:rPr>
-                    <w:t>{{salary_a_gross_salary_total_existing}}</w:t>
+                    <w:t>{{salary_g_existing}}</w:t>
                   </w:r>
                   <w:r>
                     <w:rPr>
@@ -1815,7 +1830,7 @@
                       <w:lang w:eastAsia="en-IN"/>
                       <w14:ligatures w14:val="none"/>
                     </w:rPr>
-                    <w:t>{{salary_a_gross_salary_total_revised}}</w:t>
+                    <w:t>{{salary_g_revised}}</w:t>
                   </w:r>
                 </w:p>
               </w:tc>
@@ -1901,7 +1916,7 @@
                       <w:lang w:eastAsia="en-IN"/>
                       <w14:ligatures w14:val="none"/>
                     </w:rPr>
-                    <w:t>{{salary_employer_contribution_pf_12_existing}}</w:t>
+                    <w:t>{{salary_pf_existing}}</w:t>
                   </w:r>
                   <w:r>
                     <w:rPr>
@@ -1953,7 +1968,7 @@
                       <w:lang w:eastAsia="en-IN"/>
                       <w14:ligatures w14:val="none"/>
                     </w:rPr>
-                    <w:t>{{salary_employer_contribution_pf_12_revised}}</w:t>
+                    <w:t>{{salary_pf_revised}}</w:t>
                   </w:r>
                 </w:p>
               </w:tc>
@@ -2039,7 +2054,7 @@
                       <w:lang w:eastAsia="en-IN"/>
                       <w14:ligatures w14:val="none"/>
                     </w:rPr>
-                    <w:t>{{salary_employer_contribution_esi_3_25_existing}}</w:t>
+                    <w:t>{{salary_esi_existing}}</w:t>
                   </w:r>
                   <w:r>
                     <w:rPr>
@@ -2091,7 +2106,7 @@
                       <w:lang w:eastAsia="en-IN"/>
                       <w14:ligatures w14:val="none"/>
                     </w:rPr>
-                    <w:t>{{salary_employer_contribution_esi_3_25_revised}}</w:t>
+                    <w:t>{{salary_esi_revised}}</w:t>
                   </w:r>
                 </w:p>
               </w:tc>
@@ -2209,7 +2224,7 @@
                       <w:lang w:eastAsia="en-IN"/>
                       <w14:ligatures w14:val="none"/>
                     </w:rPr>
-                    <w:t>{{salary_b_employee_retiral_total_existing}}</w:t>
+                    <w:t>{{salary_r_existing}}</w:t>
                   </w:r>
                 </w:p>
               </w:tc>
@@ -2254,7 +2269,7 @@
                       <w:lang w:eastAsia="en-IN"/>
                       <w14:ligatures w14:val="none"/>
                     </w:rPr>
-                    <w:t>{{salary_b_employee_retiral_total_revised}}</w:t>
+                    <w:t>{{salary_r_revised}}</w:t>
                   </w:r>
                 </w:p>
               </w:tc>
@@ -2340,7 +2355,7 @@
                       <w:lang w:eastAsia="en-IN"/>
                       <w14:ligatures w14:val="none"/>
                     </w:rPr>
-                    <w:t>{{salary_residential_telephone_reimbursement_existing}}</w:t>
+                    <w:t>{{salary_ph_existing}}</w:t>
                   </w:r>
                 </w:p>
               </w:tc>
@@ -2381,7 +2396,7 @@
                       <w:lang w:eastAsia="en-IN"/>
                       <w14:ligatures w14:val="none"/>
                     </w:rPr>
-                    <w:t>{{salary_residential_telephone_reimbursement_revised}}</w:t>
+                    <w:t>{{salary_ph_revised}}</w:t>
                   </w:r>
                 </w:p>
               </w:tc>
@@ -2467,7 +2482,7 @@
                       <w:lang w:eastAsia="en-IN"/>
                       <w14:ligatures w14:val="none"/>
                     </w:rPr>
-                    <w:t>{{salary_car_fuel_and_maintenance_allowance_existing}}</w:t>
+                    <w:t>{{salary_car_existing}}</w:t>
                   </w:r>
                 </w:p>
               </w:tc>
@@ -2508,7 +2523,7 @@
                       <w:lang w:eastAsia="en-IN"/>
                       <w14:ligatures w14:val="none"/>
                     </w:rPr>
-                    <w:t>{{salary_car_fuel_and_maintenance_allowance_revised}}</w:t>
+                    <w:t>{{salary_car_revised}}</w:t>
                   </w:r>
                 </w:p>
               </w:tc>
@@ -2599,7 +2614,7 @@
                       <w:lang w:eastAsia="en-IN"/>
                       <w14:ligatures w14:val="none"/>
                     </w:rPr>
-                    <w:t>{{salary_monthly_perquisites_total_existing}}</w:t>
+                    <w:t>{{salary_q_existing}}</w:t>
                   </w:r>
                 </w:p>
               </w:tc>
@@ -2640,7 +2655,7 @@
                       <w:lang w:eastAsia="en-IN"/>
                       <w14:ligatures w14:val="none"/>
                     </w:rPr>
-                    <w:t>{{salary_monthly_perquisites_total_revised}}</w:t>
+                    <w:t>{{salary_q_revised}}</w:t>
                   </w:r>
                 </w:p>
               </w:tc>
@@ -2726,7 +2741,7 @@
                       <w:lang w:eastAsia="en-IN"/>
                       <w14:ligatures w14:val="none"/>
                     </w:rPr>
-                    <w:t>{{salary_group_medical_insurance_policy_premium_gmc_existing}}</w:t>
+                    <w:t>{{salary_gmc_existing}}</w:t>
                   </w:r>
                 </w:p>
               </w:tc>
@@ -2767,7 +2782,7 @@
                       <w:lang w:eastAsia="en-IN"/>
                       <w14:ligatures w14:val="none"/>
                     </w:rPr>
-                    <w:t>{{salary_group_medical_insurance_policy_premium_gmc_revised}}</w:t>
+                    <w:t>{{salary_gmc_revised}}</w:t>
                   </w:r>
                 </w:p>
               </w:tc>
@@ -2853,7 +2868,7 @@
                       <w:lang w:eastAsia="en-IN"/>
                       <w14:ligatures w14:val="none"/>
                     </w:rPr>
-                    <w:t>{{salary_group_personal_accident_policy_gpa_existing}}</w:t>
+                    <w:t>{{salary_gpa_existing}}</w:t>
                   </w:r>
                 </w:p>
               </w:tc>
@@ -2894,7 +2909,7 @@
                       <w:lang w:eastAsia="en-IN"/>
                       <w14:ligatures w14:val="none"/>
                     </w:rPr>
-                    <w:t>{{salary_group_personal_accident_policy_gpa_revised}}</w:t>
+                    <w:t>{{salary_gpa_revised}}</w:t>
                   </w:r>
                 </w:p>
               </w:tc>
@@ -2980,7 +2995,7 @@
                       <w:lang w:eastAsia="en-IN"/>
                       <w14:ligatures w14:val="none"/>
                     </w:rPr>
-                    <w:t>{{salary_employee_benefits_total_existing}}</w:t>
+                    <w:t>{{salary_bn_existing}}</w:t>
                   </w:r>
                 </w:p>
               </w:tc>
@@ -3016,7 +3031,7 @@
                       <w:lang w:eastAsia="en-IN"/>
                       <w14:ligatures w14:val="none"/>
                     </w:rPr>
-                    <w:t>{{salary_employee_benefits_total_revised}}</w:t>
+                    <w:t>{{salary_bn_revised}}</w:t>
                   </w:r>
                 </w:p>
               </w:tc>
@@ -3109,7 +3124,7 @@
                       <w:lang w:eastAsia="en-IN"/>
                       <w14:ligatures w14:val="none"/>
                     </w:rPr>
-                    <w:t>{{salary_fixed_compensation_in_hand_existing}}</w:t>
+                    <w:t>{{salary_f_existing}}</w:t>
                   </w:r>
                   <w:r>
                     <w:rPr>
@@ -3173,7 +3188,7 @@
                       <w:lang w:eastAsia="en-IN"/>
                       <w14:ligatures w14:val="none"/>
                     </w:rPr>
-                    <w:t>{{salary_fixed_compensation_in_hand_revised}}</w:t>
+                    <w:t>{{salary_f_revised}}</w:t>
                   </w:r>
                   <w:r>
                     <w:rPr>
@@ -3281,7 +3296,7 @@
                       <w:lang w:eastAsia="en-IN"/>
                       <w14:ligatures w14:val="none"/>
                     </w:rPr>
-                    <w:t>{{salary_cost_to_company_ctc_per_annum_total_existing}}</w:t>
+                    <w:t>{{salary_ctc_existing}}</w:t>
                   </w:r>
                 </w:p>
               </w:tc>
@@ -3327,7 +3342,7 @@
                       <w:lang w:eastAsia="en-IN"/>
                       <w14:ligatures w14:val="none"/>
                     </w:rPr>
-                    <w:t>{{salary_cost_to_company_ctc_per_annum_total_revised}}</w:t>
+                    <w:t>{{salary_ctc_revised}}</w:t>
                   </w:r>
                   <w:r>
                     <w:rPr>
@@ -3467,7 +3482,7 @@
                       <w:lang w:eastAsia="en-IN"/>
                       <w14:ligatures w14:val="none"/>
                     </w:rPr>
-                    <w:t>{{salary_mobile_limit_per_month_revised}}</w:t>
+                    <w:t>{{salary_mob_revised}}</w:t>
                   </w:r>
                 </w:p>
               </w:tc>
@@ -3686,6 +3701,8 @@
     </w:tbl>
     <w:p>
       <w:pPr>
+        <w:pageBreakBefore/>
+        <w:spacing w:before="2000"/>
         <w:rPr>
           <w:sz w:val="22"/>
           <w:szCs w:val="22"/>
@@ -3701,6 +3718,7 @@
     </w:p>
     <w:p>
       <w:pPr>
+        <w:keepNext/>
         <w:rPr>
           <w:rFonts w:ascii="Times New Roman" w:hAnsi="Times New Roman" w:cs="Times New Roman"/>
           <w:b/>
@@ -3728,6 +3746,7 @@
     </w:p>
     <w:p>
       <w:pPr>
+        <w:keepNext/>
         <w:rPr>
           <w:rFonts w:ascii="Times New Roman" w:hAnsi="Times New Roman" w:cs="Times New Roman"/>
           <w:b/>
@@ -3738,6 +3757,7 @@
     </w:p>
     <w:p>
       <w:pPr>
+        <w:keepNext/>
         <w:rPr>
           <w:rFonts w:ascii="Times New Roman" w:hAnsi="Times New Roman" w:cs="Times New Roman"/>
           <w:b/>
@@ -3748,6 +3768,7 @@
     </w:p>
     <w:p>
       <w:pPr>
+        <w:keepNext/>
         <w:rPr>
           <w:rFonts w:ascii="Times New Roman" w:hAnsi="Times New Roman" w:cs="Times New Roman"/>
           <w:b/>
@@ -3758,6 +3779,8 @@
     </w:p>
     <w:p>
       <w:pPr>
+        <w:keepNext/>
+        <w:keepLines/>
         <w:rPr>
           <w:rFonts w:ascii="Times New Roman" w:hAnsi="Times New Roman" w:cs="Times New Roman"/>
           <w:b/>
@@ -3803,7 +3826,7 @@
       <w:headerReference w:type="default" r:id="rId7"/>
       <w:footerReference w:type="default" r:id="rId8"/>
       <w:pgSz w:w="11906" w:h="16838"/>
-      <w:pgMar w:top="1440" w:right="1440" w:bottom="1440" w:left="1440" w:header="708" w:footer="708" w:gutter="0"/>
+      <w:pgMar w:top="2160" w:right="1224" w:bottom="1368" w:left="1224" w:header="708" w:footer="708" w:gutter="0"/>
       <w:cols w:space="708"/>
       <w:docGrid w:linePitch="360"/>
     </w:sectPr>
@@ -3813,11 +3836,7 @@
 
 <file path=word/footer1.xml><?xml version="1.0" encoding="utf-8"?>
 <w:ftr xmlns:m="http://schemas.openxmlformats.org/officeDocument/2006/math" xmlns:mc="http://schemas.openxmlformats.org/markup-compatibility/2006" xmlns:mo="http://schemas.microsoft.com/office/mac/office/2008/main" xmlns:mv="urn:schemas-microsoft-com:mac:vml" xmlns:o="urn:schemas-microsoft-com:office:office" xmlns:r="http://schemas.openxmlformats.org/officeDocument/2006/relationships" xmlns:v="urn:schemas-microsoft-com:vml" xmlns:w10="urn:schemas-microsoft-com:office:word" xmlns:w14="http://schemas.microsoft.com/office/word/2010/wordml" xmlns:w="http://schemas.openxmlformats.org/wordprocessingml/2006/main" xmlns:wne="http://schemas.microsoft.com/office/word/2006/wordml" xmlns:wp14="http://schemas.microsoft.com/office/word/2010/wordprocessingDrawing" xmlns:wp="http://schemas.openxmlformats.org/drawingml/2006/wordprocessingDrawing" xmlns:wpc="http://schemas.microsoft.com/office/word/2010/wordprocessingCanvas" xmlns:wpg="http://schemas.microsoft.com/office/word/2010/wordprocessingGroup" xmlns:wpi="http://schemas.microsoft.com/office/word/2010/wordprocessingInk" xmlns:wps="http://schemas.microsoft.com/office/word/2010/wordprocessingShape" mc:Ignorable="w14 wp14">
-  <w:p>
-    <w:pPr>
-      <w:pStyle w:val="Footer"/>
-    </w:pPr>
-  </w:p>
+  <w:p/>
 </w:ftr>
 </file>
 

</xml_diff>